<commit_message>
feat: preserve monthly source metadata
</commit_message>
<xml_diff>
--- a/assets/patient-interview-records-template.docx
+++ b/assets/patient-interview-records-template.docx
@@ -15,7 +15,7 @@
           <w:sz w:val="44"/>
           <w:szCs w:val="44"/>
         </w:rPr>
-        <w:t>腔内连发施夹器患者</w:t>
+        <w:t>患者访谈记录明细</w:t>
       </w:r>
       <w:r>
         <w:rPr>
@@ -26,7 +26,7 @@
           <w:szCs w:val="44"/>
           <w:lang w:val="en-US" w:eastAsia="zh-CN"/>
         </w:rPr>
-        <w:t>访谈</w:t>
+        <w:t/>
       </w:r>
       <w:r>
         <w:rPr>
@@ -36,7 +36,7 @@
           <w:sz w:val="44"/>
           <w:szCs w:val="44"/>
         </w:rPr>
-        <w:t>记录</w:t>
+        <w:t/>
       </w:r>
     </w:p>
     <w:p>
@@ -96,7 +96,7 @@
           <w:sz w:val="24"/>
           <w:szCs w:val="24"/>
         </w:rPr>
-        <w:t>本次调研共访谈10位微创手术术后患者，均使用了腔内连发施夹器。年龄跨度2</w:t>
+        <w:t>本次调研访谈10位发生中度不良反应的患者。年龄跨度27-68岁，性别分布为男4人、女6人，覆盖肝血管瘤、肺大疱、急性阑尾炎、肺癌、子宫腺肌症、切口疝、肺结节、肾上腺肿瘤等多种疾病类型。10位患者均来自北京市。有9位患者均完成1次AI随访和1次症状自评，有1位患者完成1次AI随访和2次症状自评。具体信息如下：</w:t>
       </w:r>
       <w:r>
         <w:rPr>
@@ -105,7 +105,7 @@
           <w:szCs w:val="24"/>
           <w:lang w:val="en-US" w:eastAsia="zh-CN"/>
         </w:rPr>
-        <w:t>7</w:t>
+        <w:t/>
       </w:r>
       <w:r>
         <w:rPr>
@@ -113,7 +113,7 @@
           <w:sz w:val="24"/>
           <w:szCs w:val="24"/>
         </w:rPr>
-        <w:t>-6</w:t>
+        <w:t/>
       </w:r>
       <w:r>
         <w:rPr>
@@ -122,7 +122,7 @@
           <w:szCs w:val="24"/>
           <w:lang w:val="en-US" w:eastAsia="zh-CN"/>
         </w:rPr>
-        <w:t>8</w:t>
+        <w:t/>
       </w:r>
       <w:r>
         <w:rPr>
@@ -130,7 +130,7 @@
           <w:sz w:val="24"/>
           <w:szCs w:val="24"/>
         </w:rPr>
-        <w:t>岁，性别分布为男</w:t>
+        <w:t/>
       </w:r>
       <w:r>
         <w:rPr>
@@ -139,7 +139,7 @@
           <w:szCs w:val="24"/>
           <w:lang w:val="en-US" w:eastAsia="zh-CN"/>
         </w:rPr>
-        <w:t>4</w:t>
+        <w:t/>
       </w:r>
       <w:r>
         <w:rPr>
@@ -147,7 +147,7 @@
           <w:sz w:val="24"/>
           <w:szCs w:val="24"/>
         </w:rPr>
-        <w:t>人、女</w:t>
+        <w:t/>
       </w:r>
       <w:r>
         <w:rPr>
@@ -156,7 +156,7 @@
           <w:szCs w:val="24"/>
           <w:lang w:val="en-US" w:eastAsia="zh-CN"/>
         </w:rPr>
-        <w:t>6</w:t>
+        <w:t/>
       </w:r>
       <w:r>
         <w:rPr>
@@ -164,7 +164,7 @@
           <w:sz w:val="24"/>
           <w:szCs w:val="24"/>
         </w:rPr>
-        <w:t>人，覆盖肝血管瘤、肺大疱、急性阑尾炎、肺癌、子宫腺肌症、切口疝、肺结节、肾上腺肿瘤等多种疾病类型。10位患者</w:t>
+        <w:t/>
       </w:r>
       <w:r>
         <w:rPr>
@@ -173,7 +173,7 @@
           <w:szCs w:val="24"/>
           <w:lang w:val="en-US" w:eastAsia="zh-CN"/>
         </w:rPr>
-        <w:t>均来自北京市</w:t>
+        <w:t/>
       </w:r>
       <w:r>
         <w:rPr>
@@ -181,7 +181,7 @@
           <w:sz w:val="24"/>
           <w:szCs w:val="24"/>
         </w:rPr>
-        <w:t>。</w:t>
+        <w:t/>
       </w:r>
       <w:r>
         <w:rPr>
@@ -190,7 +190,7 @@
           <w:szCs w:val="24"/>
           <w:lang w:val="en-US" w:eastAsia="zh-CN"/>
         </w:rPr>
-        <w:t>有9位患者均完成</w:t>
+        <w:t/>
       </w:r>
       <w:r>
         <w:rPr>
@@ -200,7 +200,7 @@
           <w:sz w:val="24"/>
           <w:szCs w:val="24"/>
         </w:rPr>
-        <w:t>1次AI随访和1次症状自评</w:t>
+        <w:t/>
       </w:r>
       <w:r>
         <w:rPr>
@@ -211,7 +211,7 @@
           <w:szCs w:val="24"/>
           <w:lang w:eastAsia="zh-CN"/>
         </w:rPr>
-        <w:t>，</w:t>
+        <w:t/>
       </w:r>
       <w:r>
         <w:rPr>
@@ -222,7 +222,7 @@
           <w:szCs w:val="24"/>
           <w:lang w:val="en-US" w:eastAsia="zh-CN"/>
         </w:rPr>
-        <w:t>有1位患者完成</w:t>
+        <w:t/>
       </w:r>
       <w:r>
         <w:rPr>
@@ -232,7 +232,7 @@
           <w:sz w:val="24"/>
           <w:szCs w:val="24"/>
         </w:rPr>
-        <w:t>1次AI随访和</w:t>
+        <w:t/>
       </w:r>
       <w:r>
         <w:rPr>
@@ -243,7 +243,7 @@
           <w:szCs w:val="24"/>
           <w:lang w:val="en-US" w:eastAsia="zh-CN"/>
         </w:rPr>
-        <w:t>2</w:t>
+        <w:t/>
       </w:r>
       <w:r>
         <w:rPr>
@@ -253,7 +253,7 @@
           <w:sz w:val="24"/>
           <w:szCs w:val="24"/>
         </w:rPr>
-        <w:t>次症状自评</w:t>
+        <w:t/>
       </w:r>
       <w:r>
         <w:rPr>
@@ -264,7 +264,7 @@
           <w:szCs w:val="24"/>
           <w:lang w:eastAsia="zh-CN"/>
         </w:rPr>
-        <w:t>。</w:t>
+        <w:t/>
       </w:r>
       <w:r>
         <w:rPr>
@@ -272,7 +272,7 @@
           <w:sz w:val="24"/>
           <w:szCs w:val="24"/>
         </w:rPr>
-        <w:t>具体信息如下：</w:t>
+        <w:t/>
       </w:r>
     </w:p>
     <w:tbl>

</xml_diff>